<commit_message>
added L I C E N S E S   &   C E R T I F I C A T I O N S  section to resume
</commit_message>
<xml_diff>
--- a/Jordan Alexis Full Resume.docx
+++ b/Jordan Alexis Full Resume.docx
@@ -1507,6 +1507,233 @@
         </w:pBdr>
         <w:spacing w:before="160" w:after="20"/>
         <w:rPr>
+          <w:rFonts w:ascii="Calibri Light" w:hAnsi="Calibri Light"/>
+          <w:b/>
+          <w:caps/>
+          <w:color w:val="318AA0"/>
+          <w:spacing w:val="38"/>
+          <w:sz w:val="28"/>
+          <w:szCs w:val="28"/>
+        </w:rPr>
+      </w:pPr>
+      <w:r>
+        <w:rPr>
+          <w:rFonts w:ascii="Calibri Light" w:hAnsi="Calibri Light"/>
+          <w:b/>
+          <w:caps/>
+          <w:color w:val="318AA0"/>
+          <w:spacing w:val="38"/>
+          <w:sz w:val="28"/>
+          <w:szCs w:val="28"/>
+        </w:rPr>
+        <w:t>LICENSES &amp; CERTIFICATIONS</w:t>
+      </w:r>
+    </w:p>
+    <w:p>
+      <w:pPr>
+        <w:tabs>
+          <w:tab w:val="right" w:pos="10780"/>
+        </w:tabs>
+        <w:spacing w:before="60"/>
+        <w:rPr>
+          <w:rFonts w:ascii="Calibri Light" w:hAnsi="Calibri Light" w:cs="Calibri Light"/>
+          <w:i/>
+          <w:sz w:val="2"/>
+          <w:szCs w:val="2"/>
+        </w:rPr>
+      </w:pPr>
+      <w:r>
+        <w:rPr>
+          <w:rFonts w:ascii="Calibri Light" w:hAnsi="Calibri Light" w:cs="Calibri Light"/>
+          <w:b/>
+          <w:bCs/>
+          <w:caps/>
+        </w:rPr>
+        <w:t>Year Up United/Pluralsight</w:t>
+      </w:r>
+      <w:r>
+        <w:rPr>
+          <w:rFonts w:ascii="Calibri Light" w:hAnsi="Calibri Light" w:cs="Calibri Light"/>
+          <w:b/>
+          <w:bCs/>
+          <w:i/>
+        </w:rPr>
+        <w:t xml:space="preserve"> - </w:t>
+      </w:r>
+      <w:r>
+        <w:rPr>
+          <w:rFonts w:ascii="Calibri Light" w:hAnsi="Calibri Light" w:cs="Calibri Light"/>
+          <w:i/>
+          <w:iCs/>
+          <w:sz w:val="23"/>
+          <w:szCs w:val="23"/>
+        </w:rPr>
+        <w:t>Java Focus – 12</w:t>
+      </w:r>
+      <w:r>
+        <w:rPr>
+          <w:rFonts w:ascii="Calibri Light" w:hAnsi="Calibri Light" w:cs="Calibri Light"/>
+          <w:i/>
+          <w:iCs/>
+          <w:sz w:val="23"/>
+          <w:szCs w:val="23"/>
+        </w:rPr>
+        <w:noBreakHyphen/>
+        <w:t>Week Immersive Developer Academy</w:t>
+      </w:r>
+      <w:r>
+        <w:rPr>
+          <w:rFonts w:ascii="Calibri Light" w:hAnsi="Calibri Light" w:cs="Calibri Light"/>
+          <w:i/>
+          <w:sz w:val="21"/>
+          <w:szCs w:val="21"/>
+        </w:rPr>
+        <w:tab/>
+        <w:t>June 2025</w:t>
+      </w:r>
+    </w:p>
+    <w:p>
+      <w:pPr>
+        <w:tabs>
+          <w:tab w:val="right" w:pos="10780"/>
+        </w:tabs>
+        <w:rPr>
+          <w:rFonts w:ascii="Calibri Light" w:hAnsi="Calibri Light" w:cs="Calibri Light"/>
+          <w:i/>
+          <w:sz w:val="2"/>
+          <w:szCs w:val="2"/>
+        </w:rPr>
+      </w:pPr>
+    </w:p>
+    <w:p>
+      <w:pPr>
+        <w:tabs>
+          <w:tab w:val="right" w:pos="10780"/>
+        </w:tabs>
+        <w:spacing w:before="60"/>
+        <w:rPr>
+          <w:rFonts w:ascii="Calibri Light" w:hAnsi="Calibri Light" w:cs="Calibri Light"/>
+          <w:i/>
+          <w:sz w:val="2"/>
+          <w:szCs w:val="2"/>
+        </w:rPr>
+      </w:pPr>
+      <w:r>
+        <w:rPr>
+          <w:rFonts w:ascii="Calibri Light" w:hAnsi="Calibri Light" w:cs="Calibri Light"/>
+          <w:b/>
+          <w:bCs/>
+          <w:caps/>
+        </w:rPr>
+        <w:t>Year Up United</w:t>
+      </w:r>
+      <w:r>
+        <w:rPr>
+          <w:rFonts w:ascii="Calibri Light" w:hAnsi="Calibri Light" w:cs="Calibri Light"/>
+          <w:b/>
+          <w:bCs/>
+          <w:i/>
+        </w:rPr>
+        <w:t xml:space="preserve"> - </w:t>
+      </w:r>
+      <w:r>
+        <w:rPr>
+          <w:rFonts w:ascii="Calibri Light" w:hAnsi="Calibri Light" w:cs="Calibri Light"/>
+          <w:i/>
+          <w:iCs/>
+          <w:sz w:val="23"/>
+          <w:szCs w:val="23"/>
+        </w:rPr>
+        <w:t>Career Pathways Certificate of Completion — Year Up United</w:t>
+      </w:r>
+      <w:r>
+        <w:rPr>
+          <w:rFonts w:ascii="Calibri Light" w:hAnsi="Calibri Light" w:cs="Calibri Light"/>
+          <w:i/>
+          <w:sz w:val="21"/>
+          <w:szCs w:val="21"/>
+        </w:rPr>
+        <w:tab/>
+        <w:t>Jan. 2026</w:t>
+      </w:r>
+    </w:p>
+    <w:p>
+      <w:pPr>
+        <w:tabs>
+          <w:tab w:val="right" w:pos="10780"/>
+        </w:tabs>
+        <w:rPr>
+          <w:rFonts w:ascii="Calibri Light" w:hAnsi="Calibri Light" w:cs="Calibri Light"/>
+          <w:i/>
+          <w:sz w:val="2"/>
+          <w:szCs w:val="2"/>
+        </w:rPr>
+      </w:pPr>
+    </w:p>
+    <w:p>
+      <w:pPr>
+        <w:tabs>
+          <w:tab w:val="right" w:pos="10780"/>
+        </w:tabs>
+        <w:spacing w:before="60"/>
+        <w:rPr>
+          <w:rStyle w:val="Section-name"/>
+          <w:rFonts w:ascii="Calibri Light" w:hAnsi="Calibri Light" w:cs="Calibri Light"/>
+          <w:b w:val="0"/>
+          <w:i/>
+          <w:caps w:val="0"/>
+          <w:color w:val="auto"/>
+          <w:spacing w:val="0"/>
+          <w:sz w:val="2"/>
+          <w:szCs w:val="2"/>
+        </w:rPr>
+      </w:pPr>
+      <w:r>
+        <w:rPr>
+          <w:rFonts w:ascii="Calibri Light" w:hAnsi="Calibri Light" w:cs="Calibri Light"/>
+          <w:b/>
+          <w:bCs/>
+          <w:caps/>
+        </w:rPr>
+        <w:t>Coursera</w:t>
+      </w:r>
+      <w:r>
+        <w:rPr>
+          <w:rFonts w:ascii="Calibri Light" w:hAnsi="Calibri Light" w:cs="Calibri Light"/>
+          <w:b/>
+          <w:bCs/>
+          <w:i/>
+        </w:rPr>
+        <w:t xml:space="preserve"> - </w:t>
+      </w:r>
+      <w:r>
+        <w:rPr>
+          <w:rFonts w:ascii="Calibri Light" w:hAnsi="Calibri Light" w:cs="Calibri Light"/>
+          <w:i/>
+          <w:iCs/>
+          <w:sz w:val="23"/>
+          <w:szCs w:val="23"/>
+        </w:rPr>
+        <w:t>Google Data Analytics Professional Certificate</w:t>
+      </w:r>
+      <w:r>
+        <w:rPr>
+          <w:rFonts w:ascii="Calibri Light" w:hAnsi="Calibri Light" w:cs="Calibri Light"/>
+          <w:i/>
+          <w:sz w:val="21"/>
+          <w:szCs w:val="21"/>
+        </w:rPr>
+        <w:tab/>
+        <w:t>Mar. 2026</w:t>
+      </w:r>
+    </w:p>
+    <w:p>
+      <w:pPr>
+        <w:pBdr>
+          <w:bottom w:val="single" w:sz="4" w:space="1" w:color="E7E6E6" w:themeColor="background2"/>
+        </w:pBdr>
+        <w:spacing w:before="160" w:after="20"/>
+        <w:rPr>
           <w:rStyle w:val="Section-name"/>
           <w:sz w:val="28"/>
           <w:szCs w:val="28"/>
@@ -1522,22 +1749,63 @@
       </w:r>
     </w:p>
     <w:p>
-      <w:r>
+      <w:pPr>
         <w:rPr>
           <w:rStyle w:val="Section-text2"/>
           <w:sz w:val="21"/>
           <w:szCs w:val="21"/>
         </w:rPr>
-        <w:t>Proficient in HTML, CSS, JavaScript, Python, Java, SQL, Power BI, Talend, MySQL, MongoDB, Git, GitHub, Visual Studio Code, Postman, Adobe Illustrator, Adobe Photoshop, Adobe Premiere Pro, Adobe XD, Unix, Linux, Microsoft Office 365, Google Workspace</w:t>
-      </w:r>
+      </w:pPr>
       <w:r>
         <w:rPr>
           <w:rStyle w:val="Section-text2"/>
           <w:sz w:val="21"/>
           <w:szCs w:val="21"/>
         </w:rPr>
+        <w:t>Proficient in HTML, CSS, JavaScript, Python, Java, SQL, Power BI, Talend, MySQL, MongoDB, Git, GitHub, Visual Studio Code, Postman, Adobe Illustrator, Adobe Photoshop, Adobe Premiere Pro, Adobe XD, Unix, Linux, Microsoft Office 365, Google Workspace</w:t>
+      </w:r>
+      <w:r>
+        <w:rPr>
+          <w:rStyle w:val="Section-text2"/>
+          <w:sz w:val="21"/>
+          <w:szCs w:val="21"/>
+        </w:rPr>
         <w:t>.</w:t>
       </w:r>
+    </w:p>
+    <w:p>
+      <w:pPr>
+        <w:rPr>
+          <w:rStyle w:val="Section-text2"/>
+          <w:sz w:val="21"/>
+          <w:szCs w:val="21"/>
+        </w:rPr>
+      </w:pPr>
+    </w:p>
+    <w:p>
+      <w:pPr>
+        <w:tabs>
+          <w:tab w:val="right" w:pos="10780"/>
+        </w:tabs>
+        <w:spacing w:before="60"/>
+        <w:rPr>
+          <w:rFonts w:ascii="Calibri Light" w:hAnsi="Calibri Light" w:cs="Calibri Light"/>
+          <w:i/>
+          <w:sz w:val="2"/>
+          <w:szCs w:val="2"/>
+        </w:rPr>
+      </w:pPr>
+      <w:r>
+        <w:rPr>
+          <w:rFonts w:ascii="Calibri Light" w:hAnsi="Calibri Light" w:cs="Calibri Light"/>
+          <w:i/>
+          <w:sz w:val="21"/>
+          <w:szCs w:val="21"/>
+        </w:rPr>
+        <w:tab/>
+      </w:r>
+    </w:p>
+    <w:p>
       <w:r>
         <w:br w:type="page"/>
       </w:r>
@@ -3895,7 +4163,7 @@
   <w:style w:type="paragraph" w:default="1" w:styleId="Normal">
     <w:name w:val="Normal"/>
     <w:qFormat/>
-    <w:rsid w:val="00D11A55"/>
+    <w:rsid w:val="00B0723E"/>
     <w:rPr>
       <w:rFonts w:ascii="Times New Roman" w:eastAsia="Times New Roman" w:hAnsi="Times New Roman" w:cs="Times New Roman"/>
       <w:lang w:eastAsia="en-US"/>

</xml_diff>